<commit_message>
fix(layout): hang a Latin line-end mark only when the run's east-Asian language is Japanese, Chinese or Korean, as Word does
Co-Authored-By: Claude Opus 5.5 <noreply@anthropic.com>
Signed-off-by: RyujiYasukochi <ryuji.yasu@gmail.com>
</commit_message>
<xml_diff>
--- a/tests/fixtures/list_pagination/c15_paren.docx
+++ b/tests/fixtures/list_pagination/c15_paren.docx
@@ -17,6 +17,7 @@
         <w:rPr>
           <w:rFonts w:ascii="Arial" w:hAnsi="Arial"/>
           <w:sz w:val="22"/>
+          <w:lang w:eastAsia="ja-JP"/>
         </w:rPr>
         <w:t>The regional team in North Valley reviewed the latest results for participants aged 15 to 24 years old, and recorded a delivery completion level of 63%, compared to a benchmark of 85%.</w:t>
       </w:r>
@@ -36,6 +37,7 @@
         <w:rPr>
           <w:rFonts w:ascii="Arial" w:hAnsi="Arial"/>
           <w:sz w:val="22"/>
+          <w:lang w:eastAsia="ja-JP"/>
         </w:rPr>
         <w:t>The regional team in North Valley reviewed the latest results for participants aged 15 to 24 years old, and recorded a delivery completion level of 63%, compared to a benchmark of 85%.</w:t>
       </w:r>
@@ -55,6 +57,7 @@
         <w:rPr>
           <w:rFonts w:ascii="Arial" w:hAnsi="Arial"/>
           <w:sz w:val="22"/>
+          <w:lang w:eastAsia="ja-JP"/>
         </w:rPr>
         <w:t>The regional team in North Valley reviewed the latest results for participants aged 15 to 24 years old, and recorded a delivery completion level of 63%, compared to a benchmark of 85%.</w:t>
       </w:r>
@@ -74,6 +77,7 @@
         <w:rPr>
           <w:rFonts w:ascii="Arial" w:hAnsi="Arial"/>
           <w:sz w:val="22"/>
+          <w:lang w:eastAsia="ja-JP"/>
         </w:rPr>
         <w:t>The regional team in North Valley reviewed the latest results for participants aged 15 to 24 years old, and recorded a delivery completion level of 63%, compared to a benchmark of 85%.</w:t>
       </w:r>

</xml_diff>